<commit_message>
Rewrite P1 buyer materials around practical value and route
</commit_message>
<xml_diff>
--- a/products-storage/01-zakrytie-rabot/02-ks-3.docx
+++ b/products-storage/01-zakrytie-rabot/02-ks-3.docx
@@ -1317,13 +1317,7 @@
         <w:spacing w:after="120" w:line="276"/>
       </w:pPr>
       <w:r>
-        <w:rPr>
-          <w:rFonts w:ascii="Times New Roman" w:cs="Times New Roman" w:eastAsia="Times New Roman" w:hAnsi="Times New Roman"/>
-          <w:color w:val="595959"/>
-          <w:sz w:val="19"/>
-          <w:szCs w:val="19"/>
-        </w:rPr>
-        <w:t xml:space="preserve">Все суммы заполняются вручную. Сверьте состав затрат и порядок учёта НДС с договором. Справка фиксирует стоимость и не заменяет расчёт взаиморасчётов.</w:t>
+        <w:t>Все суммы заполняются вручную. Сверьте состав затрат и порядок учёта НДС с договором. Справка фиксирует стоимость принятых работ. Сверьте её суммы с платежами и расчётом взаиморасчётов.</w:t>
       </w:r>
     </w:p>
     <w:p>

</xml_diff>